<commit_message>
Complete aligned subject program library
</commit_message>
<xml_diff>
--- a/subject-program-library/programs/Agriculture-55-Period-Teaching-Program-v2.0-Network-Benchmark.docx
+++ b/subject-program-library/programs/Agriculture-55-Period-Teaching-Program-v2.0-Network-Benchmark.docx
@@ -13,7 +13,7 @@
           <w:color w:val="BD472F"/>
           <w:sz w:val="20"/>
         </w:rPr>
-        <w:t>STAGE 4 TECHNOLOGY MANDATORY</w:t>
+        <w:t>Stage 4 Technology</w:t>
       </w:r>
     </w:p>
     <w:p>
@@ -110,7 +110,7 @@
                 <w:color w:val="FFFFFF"/>
                 <w:sz w:val="19"/>
               </w:rPr>
-              <w:t>Stage 4 Technology Mandatory</w:t>
+              <w:t>Stage 4 Technology</w:t>
             </w:r>
           </w:p>
         </w:tc>
@@ -2522,7 +2522,7 @@
                 <w:color w:val="FFFFFF"/>
                 <w:sz w:val="19"/>
               </w:rPr>
-              <w:t>Syllabus alignment</w:t>
+              <w:t>Syllabus content</w:t>
             </w:r>
           </w:p>
         </w:tc>
@@ -2550,7 +2550,7 @@
                 <w:color w:val="FFFFFF"/>
                 <w:sz w:val="19"/>
               </w:rPr>
-              <w:t>What the teacher checks</w:t>
+              <w:t>Evidence / outcomes</w:t>
             </w:r>
           </w:p>
         </w:tc>
@@ -4627,7 +4627,7 @@
                 <w:color w:val="FFFFFF"/>
                 <w:sz w:val="19"/>
               </w:rPr>
-              <w:t>Syllabus alignment</w:t>
+              <w:t>Syllabus content</w:t>
             </w:r>
           </w:p>
         </w:tc>
@@ -4655,7 +4655,7 @@
                 <w:color w:val="FFFFFF"/>
                 <w:sz w:val="19"/>
               </w:rPr>
-              <w:t>What the teacher checks</w:t>
+              <w:t>Evidence / outcomes</w:t>
             </w:r>
           </w:p>
         </w:tc>
@@ -6732,7 +6732,7 @@
                 <w:color w:val="FFFFFF"/>
                 <w:sz w:val="19"/>
               </w:rPr>
-              <w:t>Syllabus alignment</w:t>
+              <w:t>Syllabus content</w:t>
             </w:r>
           </w:p>
         </w:tc>
@@ -6760,7 +6760,7 @@
                 <w:color w:val="FFFFFF"/>
                 <w:sz w:val="19"/>
               </w:rPr>
-              <w:t>What the teacher checks</w:t>
+              <w:t>Evidence / outcomes</w:t>
             </w:r>
           </w:p>
         </w:tc>
@@ -8834,7 +8834,7 @@
                 <w:color w:val="FFFFFF"/>
                 <w:sz w:val="19"/>
               </w:rPr>
-              <w:t>Syllabus alignment</w:t>
+              <w:t>Syllabus content</w:t>
             </w:r>
           </w:p>
         </w:tc>
@@ -8862,7 +8862,7 @@
                 <w:color w:val="FFFFFF"/>
                 <w:sz w:val="19"/>
               </w:rPr>
-              <w:t>What the teacher checks</w:t>
+              <w:t>Evidence / outcomes</w:t>
             </w:r>
           </w:p>
         </w:tc>
@@ -10942,7 +10942,7 @@
                 <w:color w:val="FFFFFF"/>
                 <w:sz w:val="19"/>
               </w:rPr>
-              <w:t>Syllabus alignment</w:t>
+              <w:t>Syllabus content</w:t>
             </w:r>
           </w:p>
         </w:tc>
@@ -10970,7 +10970,7 @@
                 <w:color w:val="FFFFFF"/>
                 <w:sz w:val="19"/>
               </w:rPr>
-              <w:t>What the teacher checks</w:t>
+              <w:t>Evidence / outcomes</w:t>
             </w:r>
           </w:p>
         </w:tc>
@@ -13047,7 +13047,7 @@
                 <w:color w:val="FFFFFF"/>
                 <w:sz w:val="19"/>
               </w:rPr>
-              <w:t>Syllabus alignment</w:t>
+              <w:t>Syllabus content</w:t>
             </w:r>
           </w:p>
         </w:tc>
@@ -13075,7 +13075,7 @@
                 <w:color w:val="FFFFFF"/>
                 <w:sz w:val="19"/>
               </w:rPr>
-              <w:t>What the teacher checks</w:t>
+              <w:t>Evidence / outcomes</w:t>
             </w:r>
           </w:p>
         </w:tc>
@@ -14715,7 +14715,7 @@
         <w:color w:val="174829"/>
         <w:sz w:val="19"/>
       </w:rPr>
-      <w:t>AGRICULTURE  |  STAGE 4 TECHNOLOGY MANDATORY  |  NETWORK PROGRAM v2.0</w:t>
+      <w:t>AGRICULTURE  |  Stage 4 Technology  |  NETWORK PROGRAM v2.0</w:t>
     </w:r>
   </w:p>
 </w:hdr>

</xml_diff>